<commit_message>
New Changes to phase5
</commit_message>
<xml_diff>
--- a/FleetWise - Build and Setup Guide.docx
+++ b/FleetWise - Build and Setup Guide.docx
@@ -10973,27 +10973,9 @@
                               <w:rPr>
                                 <w:rFonts w:ascii="Cambria"/>
                                 <w:color w:val="000000"/>
-                                <w:spacing w:val="-11"/>
                                 <w:w w:val="110"/>
                               </w:rPr>
-                              <w:t xml:space="preserve"> </w:t>
-                            </w:r>
-                            <w:r>
-                              <w:rPr>
-                                <w:rFonts w:ascii="Cambria"/>
-                                <w:color w:val="000000"/>
-                                <w:w w:val="110"/>
-                              </w:rPr>
                               <w:t>\</w:t>
-                            </w:r>
-                            <w:r>
-                              <w:rPr>
-                                <w:rFonts w:ascii="Cambria"/>
-                                <w:color w:val="000000"/>
-                                <w:spacing w:val="-7"/>
-                                <w:w w:val="110"/>
-                              </w:rPr>
-                              <w:t xml:space="preserve"> </w:t>
                             </w:r>
                             <w:r>
                               <w:rPr>
@@ -11002,16 +10984,25 @@
                                 <w:spacing w:val="18"/>
                                 <w:w w:val="110"/>
                               </w:rPr>
-                              <w:t>Scripts\</w:t>
-                            </w:r>
-                            <w:r>
-                              <w:rPr>
-                                <w:rFonts w:ascii="Cambria"/>
-                                <w:color w:val="000000"/>
-                                <w:spacing w:val="-8"/>
+                              <w:t>Script</w:t>
+                            </w:r>
+                            <w:r>
+                              <w:rPr>
+                                <w:rFonts w:ascii="Cambria"/>
+                                <w:color w:val="000000"/>
+                                <w:spacing w:val="18"/>
                                 <w:w w:val="110"/>
                               </w:rPr>
-                              <w:t xml:space="preserve"> </w:t>
+                              <w:t>s</w:t>
+                            </w:r>
+                            <w:r>
+                              <w:rPr>
+                                <w:rFonts w:ascii="Cambria"/>
+                                <w:color w:val="000000"/>
+                                <w:spacing w:val="18"/>
+                                <w:w w:val="110"/>
+                              </w:rPr>
+                              <w:t>\</w:t>
                             </w:r>
                             <w:r>
                               <w:rPr>
@@ -11186,27 +11177,9 @@
                               <w:rPr>
                                 <w:rFonts w:ascii="Cambria"/>
                                 <w:color w:val="000000"/>
-                                <w:spacing w:val="-24"/>
                                 <w:w w:val="110"/>
                               </w:rPr>
-                              <w:t xml:space="preserve"> </w:t>
-                            </w:r>
-                            <w:r>
-                              <w:rPr>
-                                <w:rFonts w:ascii="Cambria"/>
-                                <w:color w:val="000000"/>
-                                <w:w w:val="110"/>
-                              </w:rPr>
                               <w:t>/</w:t>
-                            </w:r>
-                            <w:r>
-                              <w:rPr>
-                                <w:rFonts w:ascii="Cambria"/>
-                                <w:color w:val="000000"/>
-                                <w:spacing w:val="-25"/>
-                                <w:w w:val="110"/>
-                              </w:rPr>
-                              <w:t xml:space="preserve"> </w:t>
                             </w:r>
                             <w:r>
                               <w:rPr>
@@ -11221,27 +11194,9 @@
                               <w:rPr>
                                 <w:rFonts w:ascii="Cambria"/>
                                 <w:color w:val="000000"/>
-                                <w:spacing w:val="-24"/>
                                 <w:w w:val="110"/>
                               </w:rPr>
-                              <w:t xml:space="preserve"> </w:t>
-                            </w:r>
-                            <w:r>
-                              <w:rPr>
-                                <w:rFonts w:ascii="Cambria"/>
-                                <w:color w:val="000000"/>
-                                <w:w w:val="110"/>
-                              </w:rPr>
                               <w:t>/</w:t>
-                            </w:r>
-                            <w:r>
-                              <w:rPr>
-                                <w:rFonts w:ascii="Cambria"/>
-                                <w:color w:val="000000"/>
-                                <w:spacing w:val="-22"/>
-                                <w:w w:val="110"/>
-                              </w:rPr>
-                              <w:t xml:space="preserve"> </w:t>
                             </w:r>
                             <w:r>
                               <w:rPr>
@@ -11699,27 +11654,9 @@
                         <w:rPr>
                           <w:rFonts w:ascii="Cambria"/>
                           <w:color w:val="000000"/>
-                          <w:spacing w:val="-11"/>
                           <w:w w:val="110"/>
                         </w:rPr>
-                        <w:t xml:space="preserve"> </w:t>
-                      </w:r>
-                      <w:r>
-                        <w:rPr>
-                          <w:rFonts w:ascii="Cambria"/>
-                          <w:color w:val="000000"/>
-                          <w:w w:val="110"/>
-                        </w:rPr>
                         <w:t>\</w:t>
-                      </w:r>
-                      <w:r>
-                        <w:rPr>
-                          <w:rFonts w:ascii="Cambria"/>
-                          <w:color w:val="000000"/>
-                          <w:spacing w:val="-7"/>
-                          <w:w w:val="110"/>
-                        </w:rPr>
-                        <w:t xml:space="preserve"> </w:t>
                       </w:r>
                       <w:r>
                         <w:rPr>
@@ -11728,16 +11665,25 @@
                           <w:spacing w:val="18"/>
                           <w:w w:val="110"/>
                         </w:rPr>
-                        <w:t>Scripts\</w:t>
-                      </w:r>
-                      <w:r>
-                        <w:rPr>
-                          <w:rFonts w:ascii="Cambria"/>
-                          <w:color w:val="000000"/>
-                          <w:spacing w:val="-8"/>
+                        <w:t>Script</w:t>
+                      </w:r>
+                      <w:r>
+                        <w:rPr>
+                          <w:rFonts w:ascii="Cambria"/>
+                          <w:color w:val="000000"/>
+                          <w:spacing w:val="18"/>
                           <w:w w:val="110"/>
                         </w:rPr>
-                        <w:t xml:space="preserve"> </w:t>
+                        <w:t>s</w:t>
+                      </w:r>
+                      <w:r>
+                        <w:rPr>
+                          <w:rFonts w:ascii="Cambria"/>
+                          <w:color w:val="000000"/>
+                          <w:spacing w:val="18"/>
+                          <w:w w:val="110"/>
+                        </w:rPr>
+                        <w:t>\</w:t>
                       </w:r>
                       <w:r>
                         <w:rPr>
@@ -11912,27 +11858,9 @@
                         <w:rPr>
                           <w:rFonts w:ascii="Cambria"/>
                           <w:color w:val="000000"/>
-                          <w:spacing w:val="-24"/>
                           <w:w w:val="110"/>
                         </w:rPr>
-                        <w:t xml:space="preserve"> </w:t>
-                      </w:r>
-                      <w:r>
-                        <w:rPr>
-                          <w:rFonts w:ascii="Cambria"/>
-                          <w:color w:val="000000"/>
-                          <w:w w:val="110"/>
-                        </w:rPr>
                         <w:t>/</w:t>
-                      </w:r>
-                      <w:r>
-                        <w:rPr>
-                          <w:rFonts w:ascii="Cambria"/>
-                          <w:color w:val="000000"/>
-                          <w:spacing w:val="-25"/>
-                          <w:w w:val="110"/>
-                        </w:rPr>
-                        <w:t xml:space="preserve"> </w:t>
                       </w:r>
                       <w:r>
                         <w:rPr>
@@ -11947,27 +11875,9 @@
                         <w:rPr>
                           <w:rFonts w:ascii="Cambria"/>
                           <w:color w:val="000000"/>
-                          <w:spacing w:val="-24"/>
                           <w:w w:val="110"/>
                         </w:rPr>
-                        <w:t xml:space="preserve"> </w:t>
-                      </w:r>
-                      <w:r>
-                        <w:rPr>
-                          <w:rFonts w:ascii="Cambria"/>
-                          <w:color w:val="000000"/>
-                          <w:w w:val="110"/>
-                        </w:rPr>
                         <w:t>/</w:t>
-                      </w:r>
-                      <w:r>
-                        <w:rPr>
-                          <w:rFonts w:ascii="Cambria"/>
-                          <w:color w:val="000000"/>
-                          <w:spacing w:val="-22"/>
-                          <w:w w:val="110"/>
-                        </w:rPr>
-                        <w:t xml:space="preserve"> </w:t>
                       </w:r>
                       <w:r>
                         <w:rPr>
@@ -12386,15 +12296,6 @@
                               <w:rPr>
                                 <w:rFonts w:ascii="Cambria"/>
                                 <w:color w:val="000000"/>
-                                <w:spacing w:val="-37"/>
-                                <w:w w:val="134"/>
-                              </w:rPr>
-                              <w:t xml:space="preserve"> </w:t>
-                            </w:r>
-                            <w:r>
-                              <w:rPr>
-                                <w:rFonts w:ascii="Cambria"/>
-                                <w:color w:val="000000"/>
                                 <w:spacing w:val="6"/>
                                 <w:w w:val="135"/>
                               </w:rPr>
@@ -12605,15 +12506,6 @@
                           <w:w w:val="262"/>
                         </w:rPr>
                         <w:t>.</w:t>
-                      </w:r>
-                      <w:r>
-                        <w:rPr>
-                          <w:rFonts w:ascii="Cambria"/>
-                          <w:color w:val="000000"/>
-                          <w:spacing w:val="-37"/>
-                          <w:w w:val="134"/>
-                        </w:rPr>
-                        <w:t xml:space="preserve"> </w:t>
                       </w:r>
                       <w:r>
                         <w:rPr>
@@ -16361,16 +16253,16 @@
         <mc:AlternateContent>
           <mc:Choice Requires="wps">
             <w:drawing>
-              <wp:anchor distT="0" distB="0" distL="0" distR="0" simplePos="0" relativeHeight="487590912" behindDoc="1" locked="0" layoutInCell="1" allowOverlap="1" wp14:anchorId="391C471F" wp14:editId="0CE1526C">
+              <wp:anchor distT="0" distB="0" distL="0" distR="0" simplePos="0" relativeHeight="487590912" behindDoc="1" locked="0" layoutInCell="1" allowOverlap="1" wp14:anchorId="391C471F" wp14:editId="231CCD2E">
                 <wp:simplePos x="0" y="0"/>
                 <wp:positionH relativeFrom="page">
-                  <wp:posOffset>1053909</wp:posOffset>
+                  <wp:posOffset>1054100</wp:posOffset>
                 </wp:positionH>
                 <wp:positionV relativeFrom="paragraph">
-                  <wp:posOffset>109025</wp:posOffset>
+                  <wp:posOffset>107315</wp:posOffset>
                 </wp:positionV>
-                <wp:extent cx="5452745" cy="1802130"/>
-                <wp:effectExtent l="0" t="0" r="0" b="0"/>
+                <wp:extent cx="5452745" cy="1409700"/>
+                <wp:effectExtent l="0" t="0" r="14605" b="19050"/>
                 <wp:wrapTopAndBottom/>
                 <wp:docPr id="10" name="Textbox 10"/>
                 <wp:cNvGraphicFramePr>
@@ -16385,7 +16277,7 @@
                       <wps:spPr>
                         <a:xfrm>
                           <a:off x="0" y="0"/>
-                          <a:ext cx="5452745" cy="1802130"/>
+                          <a:ext cx="5452745" cy="1409700"/>
                         </a:xfrm>
                         <a:prstGeom prst="rect">
                           <a:avLst/>
@@ -16653,522 +16545,140 @@
                           </w:p>
                           <w:p>
                             <w:pPr>
-                              <w:spacing w:before="13" w:line="252" w:lineRule="auto"/>
-                              <w:ind w:left="630" w:right="1486" w:hanging="551"/>
-                              <w:rPr>
-                                <w:rFonts w:ascii="Cambria" w:hAnsi="Cambria"/>
-                                <w:color w:val="000000"/>
-                              </w:rPr>
-                            </w:pPr>
-                            <w:r>
+                              <w:spacing w:before="1" w:line="252" w:lineRule="auto"/>
+                              <w:ind w:left="624" w:right="75" w:hanging="546"/>
                               <w:rPr>
                                 <w:rFonts w:ascii="Cambria" w:hAnsi="Cambria"/>
                                 <w:color w:val="000000"/>
                                 <w:spacing w:val="15"/>
                                 <w:w w:val="110"/>
                               </w:rPr>
-                              <w:t>CREATE</w:t>
-                            </w:r>
+                            </w:pPr>
                             <w:r>
                               <w:rPr>
                                 <w:rFonts w:ascii="Cambria" w:hAnsi="Cambria"/>
                                 <w:color w:val="000000"/>
-                                <w:spacing w:val="60"/>
+                                <w:spacing w:val="15"/>
                                 <w:w w:val="110"/>
                               </w:rPr>
+                              <w:t>CREATE USER '</w:t>
+                            </w:r>
+                            <w:proofErr w:type="spellStart"/>
+                            <w:r>
+                              <w:rPr>
+                                <w:rFonts w:ascii="Cambria" w:hAnsi="Cambria"/>
+                                <w:color w:val="000000"/>
+                                <w:spacing w:val="15"/>
+                                <w:w w:val="110"/>
+                              </w:rPr>
+                              <w:t>fleetwise_user'@'localhost</w:t>
+                            </w:r>
+                            <w:proofErr w:type="spellEnd"/>
+                            <w:r>
+                              <w:rPr>
+                                <w:rFonts w:ascii="Cambria" w:hAnsi="Cambria"/>
+                                <w:color w:val="000000"/>
+                                <w:spacing w:val="15"/>
+                                <w:w w:val="110"/>
+                              </w:rPr>
+                              <w:t>'</w:t>
+                            </w:r>
+                            <w:r>
+                              <w:rPr>
+                                <w:rFonts w:ascii="Cambria" w:hAnsi="Cambria"/>
+                                <w:color w:val="000000"/>
+                                <w:spacing w:val="15"/>
+                                <w:w w:val="110"/>
+                              </w:rPr>
                               <w:t xml:space="preserve"> </w:t>
                             </w:r>
-                            <w:proofErr w:type="gramStart"/>
                             <w:r>
                               <w:rPr>
                                 <w:rFonts w:ascii="Cambria" w:hAnsi="Cambria"/>
                                 <w:color w:val="000000"/>
-                                <w:spacing w:val="13"/>
+                                <w:spacing w:val="15"/>
                                 <w:w w:val="110"/>
                               </w:rPr>
-                              <w:t>USER</w:t>
-                            </w:r>
-                            <w:r>
-                              <w:rPr>
-                                <w:rFonts w:ascii="Cambria" w:hAnsi="Cambria"/>
-                                <w:color w:val="000000"/>
-                                <w:spacing w:val="11"/>
-                                <w:w w:val="205"/>
-                              </w:rPr>
-                              <w:t xml:space="preserve"> </w:t>
-                            </w:r>
-                            <w:r>
-                              <w:rPr>
-                                <w:rFonts w:ascii="Cambria" w:hAnsi="Cambria"/>
-                                <w:color w:val="000000"/>
-                                <w:w w:val="205"/>
-                              </w:rPr>
-                              <w:t>’</w:t>
-                            </w:r>
-                            <w:proofErr w:type="gramEnd"/>
-                            <w:r>
-                              <w:rPr>
-                                <w:rFonts w:ascii="Cambria" w:hAnsi="Cambria"/>
-                                <w:color w:val="000000"/>
-                                <w:spacing w:val="-71"/>
-                                <w:w w:val="205"/>
-                              </w:rPr>
-                              <w:t xml:space="preserve"> </w:t>
-                            </w:r>
-                            <w:proofErr w:type="spellStart"/>
-                            <w:r>
-                              <w:rPr>
-                                <w:rFonts w:ascii="Cambria" w:hAnsi="Cambria"/>
-                                <w:color w:val="000000"/>
-                                <w:spacing w:val="19"/>
-                                <w:w w:val="120"/>
-                              </w:rPr>
-                              <w:t>fleetwise_</w:t>
-                            </w:r>
-                            <w:proofErr w:type="gramStart"/>
-                            <w:r>
-                              <w:rPr>
-                                <w:rFonts w:ascii="Cambria" w:hAnsi="Cambria"/>
-                                <w:color w:val="000000"/>
-                                <w:spacing w:val="19"/>
-                                <w:w w:val="120"/>
-                              </w:rPr>
-                              <w:t>user</w:t>
-                            </w:r>
-                            <w:proofErr w:type="spellEnd"/>
-                            <w:r>
-                              <w:rPr>
-                                <w:rFonts w:ascii="Cambria" w:hAnsi="Cambria"/>
-                                <w:color w:val="000000"/>
-                                <w:spacing w:val="-21"/>
-                                <w:w w:val="120"/>
-                              </w:rPr>
-                              <w:t xml:space="preserve"> </w:t>
-                            </w:r>
-                            <w:r>
-                              <w:rPr>
-                                <w:rFonts w:ascii="Cambria" w:hAnsi="Cambria"/>
-                                <w:color w:val="000000"/>
-                                <w:spacing w:val="15"/>
-                                <w:w w:val="244"/>
-                              </w:rPr>
-                              <w:t>’</w:t>
-                            </w:r>
-                            <w:proofErr w:type="gramEnd"/>
-                            <w:r>
-                              <w:rPr>
-                                <w:rFonts w:ascii="Cambria" w:hAnsi="Cambria"/>
-                                <w:color w:val="000000"/>
-                                <w:spacing w:val="15"/>
-                                <w:w w:val="67"/>
-                              </w:rPr>
-                              <w:t>@</w:t>
-                            </w:r>
-                            <w:r>
-                              <w:rPr>
-                                <w:rFonts w:ascii="Cambria" w:hAnsi="Cambria"/>
-                                <w:color w:val="000000"/>
-                                <w:spacing w:val="15"/>
-                                <w:w w:val="244"/>
-                              </w:rPr>
-                              <w:t>’</w:t>
-                            </w:r>
-                            <w:r>
-                              <w:rPr>
-                                <w:rFonts w:ascii="Cambria" w:hAnsi="Cambria"/>
-                                <w:color w:val="000000"/>
-                                <w:spacing w:val="-63"/>
-                                <w:w w:val="185"/>
-                              </w:rPr>
-                              <w:t xml:space="preserve"> </w:t>
-                            </w:r>
-                            <w:proofErr w:type="gramStart"/>
-                            <w:r>
-                              <w:rPr>
-                                <w:rFonts w:ascii="Cambria" w:hAnsi="Cambria"/>
-                                <w:color w:val="000000"/>
-                                <w:spacing w:val="17"/>
-                                <w:w w:val="120"/>
-                              </w:rPr>
-                              <w:t>localhost</w:t>
-                            </w:r>
-                            <w:r>
-                              <w:rPr>
-                                <w:rFonts w:ascii="Cambria" w:hAnsi="Cambria"/>
-                                <w:color w:val="000000"/>
-                                <w:spacing w:val="-22"/>
-                                <w:w w:val="120"/>
-                              </w:rPr>
-                              <w:t xml:space="preserve"> </w:t>
-                            </w:r>
-                            <w:r>
-                              <w:rPr>
-                                <w:rFonts w:ascii="Cambria" w:hAnsi="Cambria"/>
-                                <w:color w:val="000000"/>
-                                <w:w w:val="205"/>
-                              </w:rPr>
-                              <w:t>’</w:t>
-                            </w:r>
-                            <w:proofErr w:type="gramEnd"/>
-                            <w:r>
-                              <w:rPr>
-                                <w:rFonts w:ascii="Cambria" w:hAnsi="Cambria"/>
-                                <w:color w:val="000000"/>
-                                <w:w w:val="205"/>
-                              </w:rPr>
-                              <w:t xml:space="preserve"> </w:t>
-                            </w:r>
-                            <w:r>
-                              <w:rPr>
-                                <w:rFonts w:ascii="Cambria" w:hAnsi="Cambria"/>
-                                <w:color w:val="000000"/>
-                                <w:spacing w:val="18"/>
-                                <w:w w:val="110"/>
-                              </w:rPr>
-                              <w:t>IDENTIFIED</w:t>
-                            </w:r>
-                            <w:r>
-                              <w:rPr>
-                                <w:rFonts w:ascii="Cambria" w:hAnsi="Cambria"/>
-                                <w:color w:val="000000"/>
-                                <w:spacing w:val="80"/>
-                                <w:w w:val="110"/>
-                              </w:rPr>
-                              <w:t xml:space="preserve"> </w:t>
-                            </w:r>
-                            <w:proofErr w:type="gramStart"/>
-                            <w:r>
-                              <w:rPr>
-                                <w:rFonts w:ascii="Cambria" w:hAnsi="Cambria"/>
-                                <w:color w:val="000000"/>
-                                <w:w w:val="110"/>
-                              </w:rPr>
-                              <w:t>BY</w:t>
-                            </w:r>
-                            <w:r>
-                              <w:rPr>
-                                <w:rFonts w:ascii="Cambria" w:hAnsi="Cambria"/>
-                                <w:color w:val="000000"/>
-                                <w:spacing w:val="80"/>
-                                <w:w w:val="110"/>
-                              </w:rPr>
-                              <w:t xml:space="preserve"> </w:t>
-                            </w:r>
-                            <w:r>
-                              <w:rPr>
-                                <w:rFonts w:ascii="Cambria" w:hAnsi="Cambria"/>
-                                <w:color w:val="000000"/>
-                                <w:w w:val="110"/>
-                              </w:rPr>
-                              <w:t>’</w:t>
-                            </w:r>
-                            <w:proofErr w:type="gramEnd"/>
-                            <w:r>
-                              <w:rPr>
-                                <w:rFonts w:ascii="Cambria" w:hAnsi="Cambria"/>
-                                <w:color w:val="000000"/>
-                                <w:spacing w:val="-24"/>
-                                <w:w w:val="110"/>
-                              </w:rPr>
-                              <w:t xml:space="preserve"> </w:t>
-                            </w:r>
-                            <w:proofErr w:type="spellStart"/>
-                            <w:r>
-                              <w:rPr>
-                                <w:rFonts w:ascii="Cambria" w:hAnsi="Cambria"/>
-                                <w:color w:val="000000"/>
-                                <w:spacing w:val="19"/>
-                                <w:w w:val="110"/>
-                              </w:rPr>
-                              <w:t>secure_password_</w:t>
-                            </w:r>
-                            <w:proofErr w:type="gramStart"/>
-                            <w:r>
-                              <w:rPr>
-                                <w:rFonts w:ascii="Cambria" w:hAnsi="Cambria"/>
-                                <w:color w:val="000000"/>
-                                <w:spacing w:val="19"/>
-                                <w:w w:val="110"/>
-                              </w:rPr>
-                              <w:t>here</w:t>
-                            </w:r>
-                            <w:proofErr w:type="spellEnd"/>
-                            <w:r>
-                              <w:rPr>
-                                <w:rFonts w:ascii="Cambria" w:hAnsi="Cambria"/>
-                                <w:color w:val="000000"/>
-                                <w:spacing w:val="-17"/>
-                                <w:w w:val="110"/>
-                              </w:rPr>
-                              <w:t xml:space="preserve"> </w:t>
-                            </w:r>
-                            <w:r>
-                              <w:rPr>
-                                <w:rFonts w:ascii="Cambria" w:hAnsi="Cambria"/>
-                                <w:color w:val="000000"/>
-                                <w:w w:val="110"/>
-                              </w:rPr>
-                              <w:t>’</w:t>
-                            </w:r>
-                            <w:proofErr w:type="gramEnd"/>
-                            <w:r>
-                              <w:rPr>
-                                <w:rFonts w:ascii="Cambria" w:hAnsi="Cambria"/>
-                                <w:color w:val="000000"/>
-                                <w:w w:val="110"/>
-                              </w:rPr>
-                              <w:t>;</w:t>
+                              <w:t>IDENTIFIED BY 'password';</w:t>
                             </w:r>
                           </w:p>
                           <w:p>
                             <w:pPr>
-                              <w:spacing w:before="1" w:line="252" w:lineRule="auto"/>
-                              <w:ind w:left="624" w:right="3354" w:hanging="546"/>
-                              <w:rPr>
-                                <w:rFonts w:ascii="Cambria" w:hAnsi="Cambria"/>
-                                <w:color w:val="000000"/>
-                              </w:rPr>
-                            </w:pPr>
-                            <w:r>
+                              <w:spacing w:line="252" w:lineRule="auto"/>
+                              <w:ind w:left="78" w:right="75"/>
                               <w:rPr>
                                 <w:rFonts w:ascii="Cambria" w:hAnsi="Cambria"/>
                                 <w:color w:val="000000"/>
                                 <w:spacing w:val="14"/>
                                 <w:w w:val="105"/>
                               </w:rPr>
-                              <w:t>GRANT</w:t>
-                            </w:r>
+                            </w:pPr>
                             <w:r>
                               <w:rPr>
                                 <w:rFonts w:ascii="Cambria" w:hAnsi="Cambria"/>
                                 <w:color w:val="000000"/>
-                                <w:spacing w:val="74"/>
+                                <w:spacing w:val="14"/>
                                 <w:w w:val="105"/>
                               </w:rPr>
+                              <w:t>GRANT ALL PRIVILEGES</w:t>
+                            </w:r>
+                            <w:r>
+                              <w:rPr>
+                                <w:rFonts w:ascii="Cambria" w:hAnsi="Cambria"/>
+                                <w:color w:val="000000"/>
+                                <w:spacing w:val="14"/>
+                                <w:w w:val="105"/>
+                              </w:rPr>
                               <w:t xml:space="preserve"> </w:t>
                             </w:r>
                             <w:r>
                               <w:rPr>
                                 <w:rFonts w:ascii="Cambria" w:hAnsi="Cambria"/>
                                 <w:color w:val="000000"/>
-                                <w:spacing w:val="11"/>
+                                <w:spacing w:val="14"/>
                                 <w:w w:val="105"/>
                               </w:rPr>
-                              <w:t>ALL</w:t>
-                            </w:r>
+                              <w:t xml:space="preserve">ON </w:t>
+                            </w:r>
+                            <w:proofErr w:type="gramStart"/>
                             <w:r>
                               <w:rPr>
                                 <w:rFonts w:ascii="Cambria" w:hAnsi="Cambria"/>
                                 <w:color w:val="000000"/>
-                                <w:spacing w:val="79"/>
-                                <w:w w:val="115"/>
-                              </w:rPr>
-                              <w:t xml:space="preserve"> </w:t>
-                            </w:r>
+                                <w:spacing w:val="14"/>
+                                <w:w w:val="105"/>
+                              </w:rPr>
+                              <w:t>fleetwise.*</w:t>
+                            </w:r>
+                            <w:proofErr w:type="gramEnd"/>
                             <w:r>
                               <w:rPr>
                                 <w:rFonts w:ascii="Cambria" w:hAnsi="Cambria"/>
                                 <w:color w:val="000000"/>
-                                <w:spacing w:val="18"/>
-                                <w:w w:val="115"/>
-                              </w:rPr>
-                              <w:t>PRIVILEGES</w:t>
-                            </w:r>
+                                <w:spacing w:val="14"/>
+                                <w:w w:val="105"/>
+                              </w:rPr>
+                              <w:t xml:space="preserve"> TO '</w:t>
+                            </w:r>
+                            <w:proofErr w:type="spellStart"/>
                             <w:r>
                               <w:rPr>
                                 <w:rFonts w:ascii="Cambria" w:hAnsi="Cambria"/>
                                 <w:color w:val="000000"/>
-                                <w:spacing w:val="77"/>
-                                <w:w w:val="115"/>
-                              </w:rPr>
-                              <w:t xml:space="preserve"> </w:t>
-                            </w:r>
+                                <w:spacing w:val="14"/>
+                                <w:w w:val="105"/>
+                              </w:rPr>
+                              <w:t>fleetwise_user'@'localhost</w:t>
+                            </w:r>
+                            <w:proofErr w:type="spellEnd"/>
                             <w:r>
                               <w:rPr>
                                 <w:rFonts w:ascii="Cambria" w:hAnsi="Cambria"/>
                                 <w:color w:val="000000"/>
+                                <w:spacing w:val="14"/>
                                 <w:w w:val="105"/>
                               </w:rPr>
-                              <w:t>ON</w:t>
-                            </w:r>
-                            <w:r>
-                              <w:rPr>
-                                <w:rFonts w:ascii="Cambria" w:hAnsi="Cambria"/>
-                                <w:color w:val="000000"/>
-                                <w:spacing w:val="77"/>
-                                <w:w w:val="115"/>
-                              </w:rPr>
-                              <w:t xml:space="preserve"> </w:t>
-                            </w:r>
-                            <w:proofErr w:type="spellStart"/>
-                            <w:proofErr w:type="gramStart"/>
-                            <w:r>
-                              <w:rPr>
-                                <w:rFonts w:ascii="Cambria" w:hAnsi="Cambria"/>
-                                <w:color w:val="000000"/>
-                                <w:spacing w:val="17"/>
-                                <w:w w:val="115"/>
-                              </w:rPr>
-                              <w:t>fleetwise</w:t>
-                            </w:r>
-                            <w:proofErr w:type="spellEnd"/>
-                            <w:r>
-                              <w:rPr>
-                                <w:rFonts w:ascii="Cambria" w:hAnsi="Cambria"/>
-                                <w:color w:val="000000"/>
-                                <w:spacing w:val="-21"/>
-                                <w:w w:val="115"/>
-                              </w:rPr>
-                              <w:t xml:space="preserve"> </w:t>
-                            </w:r>
-                            <w:r>
-                              <w:rPr>
-                                <w:rFonts w:ascii="Cambria" w:hAnsi="Cambria"/>
-                                <w:color w:val="000000"/>
-                                <w:w w:val="115"/>
-                              </w:rPr>
-                              <w:t>.</w:t>
-                            </w:r>
-                            <w:proofErr w:type="gramEnd"/>
-                            <w:r>
-                              <w:rPr>
-                                <w:rFonts w:ascii="Cambria" w:hAnsi="Cambria"/>
-                                <w:color w:val="000000"/>
-                                <w:w w:val="115"/>
-                              </w:rPr>
-                              <w:t xml:space="preserve">* </w:t>
-                            </w:r>
-                            <w:proofErr w:type="gramStart"/>
-                            <w:r>
-                              <w:rPr>
-                                <w:rFonts w:ascii="Cambria" w:hAnsi="Cambria"/>
-                                <w:color w:val="000000"/>
-                                <w:w w:val="105"/>
-                              </w:rPr>
-                              <w:t>TO</w:t>
-                            </w:r>
-                            <w:r>
-                              <w:rPr>
-                                <w:rFonts w:ascii="Cambria" w:hAnsi="Cambria"/>
-                                <w:color w:val="000000"/>
-                                <w:spacing w:val="53"/>
-                                <w:w w:val="130"/>
-                              </w:rPr>
-                              <w:t xml:space="preserve"> </w:t>
-                            </w:r>
-                            <w:r>
-                              <w:rPr>
-                                <w:rFonts w:ascii="Cambria" w:hAnsi="Cambria"/>
-                                <w:color w:val="000000"/>
-                                <w:w w:val="130"/>
-                              </w:rPr>
-                              <w:t>’</w:t>
-                            </w:r>
-                            <w:proofErr w:type="gramEnd"/>
-                            <w:r>
-                              <w:rPr>
-                                <w:rFonts w:ascii="Cambria" w:hAnsi="Cambria"/>
-                                <w:color w:val="000000"/>
-                                <w:spacing w:val="-35"/>
-                                <w:w w:val="130"/>
-                              </w:rPr>
-                              <w:t xml:space="preserve"> </w:t>
-                            </w:r>
-                            <w:proofErr w:type="spellStart"/>
-                            <w:r>
-                              <w:rPr>
-                                <w:rFonts w:ascii="Cambria" w:hAnsi="Cambria"/>
-                                <w:color w:val="000000"/>
-                                <w:spacing w:val="19"/>
-                                <w:w w:val="125"/>
-                              </w:rPr>
-                              <w:t>fleetwise_</w:t>
-                            </w:r>
-                            <w:proofErr w:type="gramStart"/>
-                            <w:r>
-                              <w:rPr>
-                                <w:rFonts w:ascii="Cambria" w:hAnsi="Cambria"/>
-                                <w:color w:val="000000"/>
-                                <w:spacing w:val="19"/>
-                                <w:w w:val="125"/>
-                              </w:rPr>
-                              <w:t>user</w:t>
-                            </w:r>
-                            <w:proofErr w:type="spellEnd"/>
-                            <w:r>
-                              <w:rPr>
-                                <w:rFonts w:ascii="Cambria" w:hAnsi="Cambria"/>
-                                <w:color w:val="000000"/>
-                                <w:spacing w:val="-24"/>
-                                <w:w w:val="125"/>
-                              </w:rPr>
-                              <w:t xml:space="preserve"> </w:t>
-                            </w:r>
-                            <w:r>
-                              <w:rPr>
-                                <w:rFonts w:ascii="Cambria" w:hAnsi="Cambria"/>
-                                <w:color w:val="000000"/>
-                                <w:spacing w:val="15"/>
-                                <w:w w:val="130"/>
-                              </w:rPr>
-                              <w:t>’</w:t>
-                            </w:r>
-                            <w:proofErr w:type="gramEnd"/>
-                            <w:r>
-                              <w:rPr>
-                                <w:rFonts w:ascii="Cambria" w:hAnsi="Cambria"/>
-                                <w:color w:val="000000"/>
-                                <w:spacing w:val="15"/>
-                                <w:w w:val="130"/>
-                              </w:rPr>
-                              <w:t>@’</w:t>
-                            </w:r>
-                            <w:r>
-                              <w:rPr>
-                                <w:rFonts w:ascii="Cambria" w:hAnsi="Cambria"/>
-                                <w:color w:val="000000"/>
-                                <w:spacing w:val="-36"/>
-                                <w:w w:val="130"/>
-                              </w:rPr>
-                              <w:t xml:space="preserve"> </w:t>
-                            </w:r>
-                            <w:proofErr w:type="gramStart"/>
-                            <w:r>
-                              <w:rPr>
-                                <w:rFonts w:ascii="Cambria" w:hAnsi="Cambria"/>
-                                <w:color w:val="000000"/>
-                                <w:spacing w:val="17"/>
-                                <w:w w:val="125"/>
-                              </w:rPr>
-                              <w:t>localhost</w:t>
-                            </w:r>
-                            <w:r>
-                              <w:rPr>
-                                <w:rFonts w:ascii="Cambria" w:hAnsi="Cambria"/>
-                                <w:color w:val="000000"/>
-                                <w:spacing w:val="-25"/>
-                                <w:w w:val="125"/>
-                              </w:rPr>
-                              <w:t xml:space="preserve"> </w:t>
-                            </w:r>
-                            <w:r>
-                              <w:rPr>
-                                <w:rFonts w:ascii="Cambria" w:hAnsi="Cambria"/>
-                                <w:color w:val="000000"/>
-                                <w:spacing w:val="9"/>
-                                <w:w w:val="130"/>
-                              </w:rPr>
-                              <w:t>’</w:t>
-                            </w:r>
-                            <w:proofErr w:type="gramEnd"/>
-                            <w:r>
-                              <w:rPr>
-                                <w:rFonts w:ascii="Cambria" w:hAnsi="Cambria"/>
-                                <w:color w:val="000000"/>
-                                <w:spacing w:val="9"/>
-                                <w:w w:val="130"/>
-                              </w:rPr>
-                              <w:t>;</w:t>
+                              <w:t>';</w:t>
                             </w:r>
                           </w:p>
                           <w:p>
@@ -17184,55 +16694,6 @@
                               <w:rPr>
                                 <w:rFonts w:ascii="Cambria"/>
                                 <w:color w:val="000000"/>
-                                <w:spacing w:val="14"/>
-                              </w:rPr>
-                              <w:t>FLUSH</w:t>
-                            </w:r>
-                            <w:r>
-                              <w:rPr>
-                                <w:rFonts w:ascii="Cambria"/>
-                                <w:color w:val="000000"/>
-                                <w:spacing w:val="80"/>
-                              </w:rPr>
-                              <w:t xml:space="preserve"> </w:t>
-                            </w:r>
-                            <w:proofErr w:type="gramStart"/>
-                            <w:r>
-                              <w:rPr>
-                                <w:rFonts w:ascii="Cambria"/>
-                                <w:color w:val="000000"/>
-                                <w:spacing w:val="18"/>
-                              </w:rPr>
-                              <w:t>PRIVILEGES</w:t>
-                            </w:r>
-                            <w:r>
-                              <w:rPr>
-                                <w:rFonts w:ascii="Cambria"/>
-                                <w:color w:val="000000"/>
-                                <w:spacing w:val="-17"/>
-                              </w:rPr>
-                              <w:t xml:space="preserve"> </w:t>
-                            </w:r>
-                            <w:r>
-                              <w:rPr>
-                                <w:rFonts w:ascii="Cambria"/>
-                                <w:color w:val="000000"/>
-                              </w:rPr>
-                              <w:t>;</w:t>
-                            </w:r>
-                            <w:proofErr w:type="gramEnd"/>
-                            <w:r>
-                              <w:rPr>
-                                <w:rFonts w:ascii="Cambria"/>
-                                <w:color w:val="000000"/>
-                              </w:rPr>
-                              <w:t xml:space="preserve"> </w:t>
-                            </w:r>
-                            <w:proofErr w:type="gramStart"/>
-                            <w:r>
-                              <w:rPr>
-                                <w:rFonts w:ascii="Cambria"/>
-                                <w:color w:val="000000"/>
                                 <w:spacing w:val="13"/>
                                 <w:w w:val="110"/>
                               </w:rPr>
@@ -17242,20 +16703,10 @@
                               <w:rPr>
                                 <w:rFonts w:ascii="Cambria"/>
                                 <w:color w:val="000000"/>
-                                <w:spacing w:val="-24"/>
-                                <w:w w:val="110"/>
-                              </w:rPr>
-                              <w:t xml:space="preserve"> </w:t>
-                            </w:r>
-                            <w:r>
-                              <w:rPr>
-                                <w:rFonts w:ascii="Cambria"/>
-                                <w:color w:val="000000"/>
                                 <w:w w:val="170"/>
                               </w:rPr>
                               <w:t>;</w:t>
                             </w:r>
-                            <w:proofErr w:type="gramEnd"/>
                           </w:p>
                         </w:txbxContent>
                       </wps:txbx>
@@ -17265,12 +16716,15 @@
                     </wps:wsp>
                   </a:graphicData>
                 </a:graphic>
+                <wp14:sizeRelV relativeFrom="margin">
+                  <wp14:pctHeight>0</wp14:pctHeight>
+                </wp14:sizeRelV>
               </wp:anchor>
             </w:drawing>
           </mc:Choice>
           <mc:Fallback>
             <w:pict>
-              <v:shape w14:anchorId="391C471F" id="Textbox 10" o:spid="_x0000_s1032" type="#_x0000_t202" style="position:absolute;margin-left:83pt;margin-top:8.6pt;width:429.35pt;height:141.9pt;z-index:-15725568;visibility:visible;mso-wrap-style:square;mso-wrap-distance-left:0;mso-wrap-distance-top:0;mso-wrap-distance-right:0;mso-wrap-distance-bottom:0;mso-position-horizontal:absolute;mso-position-horizontal-relative:page;mso-position-vertical:absolute;mso-position-vertical-relative:text;v-text-anchor:top" o:gfxdata="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" fillcolor="#f4f4f4" strokecolor="#c8c8c8" strokeweight=".14039mm">
+              <v:shape w14:anchorId="391C471F" id="Textbox 10" o:spid="_x0000_s1032" type="#_x0000_t202" style="position:absolute;margin-left:83pt;margin-top:8.45pt;width:429.35pt;height:111pt;z-index:-15725568;visibility:visible;mso-wrap-style:square;mso-height-percent:0;mso-wrap-distance-left:0;mso-wrap-distance-top:0;mso-wrap-distance-right:0;mso-wrap-distance-bottom:0;mso-position-horizontal:absolute;mso-position-horizontal-relative:page;mso-position-vertical:absolute;mso-position-vertical-relative:text;mso-height-percent:0;mso-height-relative:margin;v-text-anchor:top" o:gfxdata="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" fillcolor="#f4f4f4" strokecolor="#c8c8c8" strokeweight=".14039mm">
                 <v:path arrowok="t"/>
                 <v:textbox inset="0,0,0,0">
                   <w:txbxContent>
@@ -17525,522 +16979,140 @@
                     </w:p>
                     <w:p>
                       <w:pPr>
-                        <w:spacing w:before="13" w:line="252" w:lineRule="auto"/>
-                        <w:ind w:left="630" w:right="1486" w:hanging="551"/>
-                        <w:rPr>
-                          <w:rFonts w:ascii="Cambria" w:hAnsi="Cambria"/>
-                          <w:color w:val="000000"/>
-                        </w:rPr>
-                      </w:pPr>
-                      <w:r>
+                        <w:spacing w:before="1" w:line="252" w:lineRule="auto"/>
+                        <w:ind w:left="624" w:right="75" w:hanging="546"/>
                         <w:rPr>
                           <w:rFonts w:ascii="Cambria" w:hAnsi="Cambria"/>
                           <w:color w:val="000000"/>
                           <w:spacing w:val="15"/>
                           <w:w w:val="110"/>
                         </w:rPr>
-                        <w:t>CREATE</w:t>
-                      </w:r>
+                      </w:pPr>
                       <w:r>
                         <w:rPr>
                           <w:rFonts w:ascii="Cambria" w:hAnsi="Cambria"/>
                           <w:color w:val="000000"/>
-                          <w:spacing w:val="60"/>
+                          <w:spacing w:val="15"/>
                           <w:w w:val="110"/>
                         </w:rPr>
+                        <w:t>CREATE USER '</w:t>
+                      </w:r>
+                      <w:proofErr w:type="spellStart"/>
+                      <w:r>
+                        <w:rPr>
+                          <w:rFonts w:ascii="Cambria" w:hAnsi="Cambria"/>
+                          <w:color w:val="000000"/>
+                          <w:spacing w:val="15"/>
+                          <w:w w:val="110"/>
+                        </w:rPr>
+                        <w:t>fleetwise_user'@'localhost</w:t>
+                      </w:r>
+                      <w:proofErr w:type="spellEnd"/>
+                      <w:r>
+                        <w:rPr>
+                          <w:rFonts w:ascii="Cambria" w:hAnsi="Cambria"/>
+                          <w:color w:val="000000"/>
+                          <w:spacing w:val="15"/>
+                          <w:w w:val="110"/>
+                        </w:rPr>
+                        <w:t>'</w:t>
+                      </w:r>
+                      <w:r>
+                        <w:rPr>
+                          <w:rFonts w:ascii="Cambria" w:hAnsi="Cambria"/>
+                          <w:color w:val="000000"/>
+                          <w:spacing w:val="15"/>
+                          <w:w w:val="110"/>
+                        </w:rPr>
                         <w:t xml:space="preserve"> </w:t>
                       </w:r>
-                      <w:proofErr w:type="gramStart"/>
                       <w:r>
                         <w:rPr>
                           <w:rFonts w:ascii="Cambria" w:hAnsi="Cambria"/>
                           <w:color w:val="000000"/>
-                          <w:spacing w:val="13"/>
+                          <w:spacing w:val="15"/>
                           <w:w w:val="110"/>
                         </w:rPr>
-                        <w:t>USER</w:t>
-                      </w:r>
-                      <w:r>
-                        <w:rPr>
-                          <w:rFonts w:ascii="Cambria" w:hAnsi="Cambria"/>
-                          <w:color w:val="000000"/>
-                          <w:spacing w:val="11"/>
-                          <w:w w:val="205"/>
-                        </w:rPr>
-                        <w:t xml:space="preserve"> </w:t>
-                      </w:r>
-                      <w:r>
-                        <w:rPr>
-                          <w:rFonts w:ascii="Cambria" w:hAnsi="Cambria"/>
-                          <w:color w:val="000000"/>
-                          <w:w w:val="205"/>
-                        </w:rPr>
-                        <w:t>’</w:t>
-                      </w:r>
-                      <w:proofErr w:type="gramEnd"/>
-                      <w:r>
-                        <w:rPr>
-                          <w:rFonts w:ascii="Cambria" w:hAnsi="Cambria"/>
-                          <w:color w:val="000000"/>
-                          <w:spacing w:val="-71"/>
-                          <w:w w:val="205"/>
-                        </w:rPr>
-                        <w:t xml:space="preserve"> </w:t>
-                      </w:r>
-                      <w:proofErr w:type="spellStart"/>
-                      <w:r>
-                        <w:rPr>
-                          <w:rFonts w:ascii="Cambria" w:hAnsi="Cambria"/>
-                          <w:color w:val="000000"/>
-                          <w:spacing w:val="19"/>
-                          <w:w w:val="120"/>
-                        </w:rPr>
-                        <w:t>fleetwise_</w:t>
-                      </w:r>
-                      <w:proofErr w:type="gramStart"/>
-                      <w:r>
-                        <w:rPr>
-                          <w:rFonts w:ascii="Cambria" w:hAnsi="Cambria"/>
-                          <w:color w:val="000000"/>
-                          <w:spacing w:val="19"/>
-                          <w:w w:val="120"/>
-                        </w:rPr>
-                        <w:t>user</w:t>
-                      </w:r>
-                      <w:proofErr w:type="spellEnd"/>
-                      <w:r>
-                        <w:rPr>
-                          <w:rFonts w:ascii="Cambria" w:hAnsi="Cambria"/>
-                          <w:color w:val="000000"/>
-                          <w:spacing w:val="-21"/>
-                          <w:w w:val="120"/>
-                        </w:rPr>
-                        <w:t xml:space="preserve"> </w:t>
-                      </w:r>
-                      <w:r>
-                        <w:rPr>
-                          <w:rFonts w:ascii="Cambria" w:hAnsi="Cambria"/>
-                          <w:color w:val="000000"/>
-                          <w:spacing w:val="15"/>
-                          <w:w w:val="244"/>
-                        </w:rPr>
-                        <w:t>’</w:t>
-                      </w:r>
-                      <w:proofErr w:type="gramEnd"/>
-                      <w:r>
-                        <w:rPr>
-                          <w:rFonts w:ascii="Cambria" w:hAnsi="Cambria"/>
-                          <w:color w:val="000000"/>
-                          <w:spacing w:val="15"/>
-                          <w:w w:val="67"/>
-                        </w:rPr>
-                        <w:t>@</w:t>
-                      </w:r>
-                      <w:r>
-                        <w:rPr>
-                          <w:rFonts w:ascii="Cambria" w:hAnsi="Cambria"/>
-                          <w:color w:val="000000"/>
-                          <w:spacing w:val="15"/>
-                          <w:w w:val="244"/>
-                        </w:rPr>
-                        <w:t>’</w:t>
-                      </w:r>
-                      <w:r>
-                        <w:rPr>
-                          <w:rFonts w:ascii="Cambria" w:hAnsi="Cambria"/>
-                          <w:color w:val="000000"/>
-                          <w:spacing w:val="-63"/>
-                          <w:w w:val="185"/>
-                        </w:rPr>
-                        <w:t xml:space="preserve"> </w:t>
-                      </w:r>
-                      <w:proofErr w:type="gramStart"/>
-                      <w:r>
-                        <w:rPr>
-                          <w:rFonts w:ascii="Cambria" w:hAnsi="Cambria"/>
-                          <w:color w:val="000000"/>
-                          <w:spacing w:val="17"/>
-                          <w:w w:val="120"/>
-                        </w:rPr>
-                        <w:t>localhost</w:t>
-                      </w:r>
-                      <w:r>
-                        <w:rPr>
-                          <w:rFonts w:ascii="Cambria" w:hAnsi="Cambria"/>
-                          <w:color w:val="000000"/>
-                          <w:spacing w:val="-22"/>
-                          <w:w w:val="120"/>
-                        </w:rPr>
-                        <w:t xml:space="preserve"> </w:t>
-                      </w:r>
-                      <w:r>
-                        <w:rPr>
-                          <w:rFonts w:ascii="Cambria" w:hAnsi="Cambria"/>
-                          <w:color w:val="000000"/>
-                          <w:w w:val="205"/>
-                        </w:rPr>
-                        <w:t>’</w:t>
-                      </w:r>
-                      <w:proofErr w:type="gramEnd"/>
-                      <w:r>
-                        <w:rPr>
-                          <w:rFonts w:ascii="Cambria" w:hAnsi="Cambria"/>
-                          <w:color w:val="000000"/>
-                          <w:w w:val="205"/>
-                        </w:rPr>
-                        <w:t xml:space="preserve"> </w:t>
-                      </w:r>
-                      <w:r>
-                        <w:rPr>
-                          <w:rFonts w:ascii="Cambria" w:hAnsi="Cambria"/>
-                          <w:color w:val="000000"/>
-                          <w:spacing w:val="18"/>
-                          <w:w w:val="110"/>
-                        </w:rPr>
-                        <w:t>IDENTIFIED</w:t>
-                      </w:r>
-                      <w:r>
-                        <w:rPr>
-                          <w:rFonts w:ascii="Cambria" w:hAnsi="Cambria"/>
-                          <w:color w:val="000000"/>
-                          <w:spacing w:val="80"/>
-                          <w:w w:val="110"/>
-                        </w:rPr>
-                        <w:t xml:space="preserve"> </w:t>
-                      </w:r>
-                      <w:proofErr w:type="gramStart"/>
-                      <w:r>
-                        <w:rPr>
-                          <w:rFonts w:ascii="Cambria" w:hAnsi="Cambria"/>
-                          <w:color w:val="000000"/>
-                          <w:w w:val="110"/>
-                        </w:rPr>
-                        <w:t>BY</w:t>
-                      </w:r>
-                      <w:r>
-                        <w:rPr>
-                          <w:rFonts w:ascii="Cambria" w:hAnsi="Cambria"/>
-                          <w:color w:val="000000"/>
-                          <w:spacing w:val="80"/>
-                          <w:w w:val="110"/>
-                        </w:rPr>
-                        <w:t xml:space="preserve"> </w:t>
-                      </w:r>
-                      <w:r>
-                        <w:rPr>
-                          <w:rFonts w:ascii="Cambria" w:hAnsi="Cambria"/>
-                          <w:color w:val="000000"/>
-                          <w:w w:val="110"/>
-                        </w:rPr>
-                        <w:t>’</w:t>
-                      </w:r>
-                      <w:proofErr w:type="gramEnd"/>
-                      <w:r>
-                        <w:rPr>
-                          <w:rFonts w:ascii="Cambria" w:hAnsi="Cambria"/>
-                          <w:color w:val="000000"/>
-                          <w:spacing w:val="-24"/>
-                          <w:w w:val="110"/>
-                        </w:rPr>
-                        <w:t xml:space="preserve"> </w:t>
-                      </w:r>
-                      <w:proofErr w:type="spellStart"/>
-                      <w:r>
-                        <w:rPr>
-                          <w:rFonts w:ascii="Cambria" w:hAnsi="Cambria"/>
-                          <w:color w:val="000000"/>
-                          <w:spacing w:val="19"/>
-                          <w:w w:val="110"/>
-                        </w:rPr>
-                        <w:t>secure_password_</w:t>
-                      </w:r>
-                      <w:proofErr w:type="gramStart"/>
-                      <w:r>
-                        <w:rPr>
-                          <w:rFonts w:ascii="Cambria" w:hAnsi="Cambria"/>
-                          <w:color w:val="000000"/>
-                          <w:spacing w:val="19"/>
-                          <w:w w:val="110"/>
-                        </w:rPr>
-                        <w:t>here</w:t>
-                      </w:r>
-                      <w:proofErr w:type="spellEnd"/>
-                      <w:r>
-                        <w:rPr>
-                          <w:rFonts w:ascii="Cambria" w:hAnsi="Cambria"/>
-                          <w:color w:val="000000"/>
-                          <w:spacing w:val="-17"/>
-                          <w:w w:val="110"/>
-                        </w:rPr>
-                        <w:t xml:space="preserve"> </w:t>
-                      </w:r>
-                      <w:r>
-                        <w:rPr>
-                          <w:rFonts w:ascii="Cambria" w:hAnsi="Cambria"/>
-                          <w:color w:val="000000"/>
-                          <w:w w:val="110"/>
-                        </w:rPr>
-                        <w:t>’</w:t>
-                      </w:r>
-                      <w:proofErr w:type="gramEnd"/>
-                      <w:r>
-                        <w:rPr>
-                          <w:rFonts w:ascii="Cambria" w:hAnsi="Cambria"/>
-                          <w:color w:val="000000"/>
-                          <w:w w:val="110"/>
-                        </w:rPr>
-                        <w:t>;</w:t>
+                        <w:t>IDENTIFIED BY 'password';</w:t>
                       </w:r>
                     </w:p>
                     <w:p>
                       <w:pPr>
-                        <w:spacing w:before="1" w:line="252" w:lineRule="auto"/>
-                        <w:ind w:left="624" w:right="3354" w:hanging="546"/>
-                        <w:rPr>
-                          <w:rFonts w:ascii="Cambria" w:hAnsi="Cambria"/>
-                          <w:color w:val="000000"/>
-                        </w:rPr>
-                      </w:pPr>
-                      <w:r>
+                        <w:spacing w:line="252" w:lineRule="auto"/>
+                        <w:ind w:left="78" w:right="75"/>
                         <w:rPr>
                           <w:rFonts w:ascii="Cambria" w:hAnsi="Cambria"/>
                           <w:color w:val="000000"/>
                           <w:spacing w:val="14"/>
                           <w:w w:val="105"/>
                         </w:rPr>
-                        <w:t>GRANT</w:t>
-                      </w:r>
+                      </w:pPr>
                       <w:r>
                         <w:rPr>
                           <w:rFonts w:ascii="Cambria" w:hAnsi="Cambria"/>
                           <w:color w:val="000000"/>
-                          <w:spacing w:val="74"/>
+                          <w:spacing w:val="14"/>
                           <w:w w:val="105"/>
                         </w:rPr>
+                        <w:t>GRANT ALL PRIVILEGES</w:t>
+                      </w:r>
+                      <w:r>
+                        <w:rPr>
+                          <w:rFonts w:ascii="Cambria" w:hAnsi="Cambria"/>
+                          <w:color w:val="000000"/>
+                          <w:spacing w:val="14"/>
+                          <w:w w:val="105"/>
+                        </w:rPr>
                         <w:t xml:space="preserve"> </w:t>
                       </w:r>
                       <w:r>
                         <w:rPr>
                           <w:rFonts w:ascii="Cambria" w:hAnsi="Cambria"/>
                           <w:color w:val="000000"/>
-                          <w:spacing w:val="11"/>
+                          <w:spacing w:val="14"/>
                           <w:w w:val="105"/>
                         </w:rPr>
-                        <w:t>ALL</w:t>
-                      </w:r>
+                        <w:t xml:space="preserve">ON </w:t>
+                      </w:r>
+                      <w:proofErr w:type="gramStart"/>
                       <w:r>
                         <w:rPr>
                           <w:rFonts w:ascii="Cambria" w:hAnsi="Cambria"/>
                           <w:color w:val="000000"/>
-                          <w:spacing w:val="79"/>
-                          <w:w w:val="115"/>
-                        </w:rPr>
-                        <w:t xml:space="preserve"> </w:t>
-                      </w:r>
+                          <w:spacing w:val="14"/>
+                          <w:w w:val="105"/>
+                        </w:rPr>
+                        <w:t>fleetwise.*</w:t>
+                      </w:r>
+                      <w:proofErr w:type="gramEnd"/>
                       <w:r>
                         <w:rPr>
                           <w:rFonts w:ascii="Cambria" w:hAnsi="Cambria"/>
                           <w:color w:val="000000"/>
-                          <w:spacing w:val="18"/>
-                          <w:w w:val="115"/>
-                        </w:rPr>
-                        <w:t>PRIVILEGES</w:t>
-                      </w:r>
+                          <w:spacing w:val="14"/>
+                          <w:w w:val="105"/>
+                        </w:rPr>
+                        <w:t xml:space="preserve"> TO '</w:t>
+                      </w:r>
+                      <w:proofErr w:type="spellStart"/>
                       <w:r>
                         <w:rPr>
                           <w:rFonts w:ascii="Cambria" w:hAnsi="Cambria"/>
                           <w:color w:val="000000"/>
-                          <w:spacing w:val="77"/>
-                          <w:w w:val="115"/>
-                        </w:rPr>
-                        <w:t xml:space="preserve"> </w:t>
-                      </w:r>
+                          <w:spacing w:val="14"/>
+                          <w:w w:val="105"/>
+                        </w:rPr>
+                        <w:t>fleetwise_user'@'localhost</w:t>
+                      </w:r>
+                      <w:proofErr w:type="spellEnd"/>
                       <w:r>
                         <w:rPr>
                           <w:rFonts w:ascii="Cambria" w:hAnsi="Cambria"/>
                           <w:color w:val="000000"/>
+                          <w:spacing w:val="14"/>
                           <w:w w:val="105"/>
                         </w:rPr>
-                        <w:t>ON</w:t>
-                      </w:r>
-                      <w:r>
-                        <w:rPr>
-                          <w:rFonts w:ascii="Cambria" w:hAnsi="Cambria"/>
-                          <w:color w:val="000000"/>
-                          <w:spacing w:val="77"/>
-                          <w:w w:val="115"/>
-                        </w:rPr>
-                        <w:t xml:space="preserve"> </w:t>
-                      </w:r>
-                      <w:proofErr w:type="spellStart"/>
-                      <w:proofErr w:type="gramStart"/>
-                      <w:r>
-                        <w:rPr>
-                          <w:rFonts w:ascii="Cambria" w:hAnsi="Cambria"/>
-                          <w:color w:val="000000"/>
-                          <w:spacing w:val="17"/>
-                          <w:w w:val="115"/>
-                        </w:rPr>
-                        <w:t>fleetwise</w:t>
-                      </w:r>
-                      <w:proofErr w:type="spellEnd"/>
-                      <w:r>
-                        <w:rPr>
-                          <w:rFonts w:ascii="Cambria" w:hAnsi="Cambria"/>
-                          <w:color w:val="000000"/>
-                          <w:spacing w:val="-21"/>
-                          <w:w w:val="115"/>
-                        </w:rPr>
-                        <w:t xml:space="preserve"> </w:t>
-                      </w:r>
-                      <w:r>
-                        <w:rPr>
-                          <w:rFonts w:ascii="Cambria" w:hAnsi="Cambria"/>
-                          <w:color w:val="000000"/>
-                          <w:w w:val="115"/>
-                        </w:rPr>
-                        <w:t>.</w:t>
-                      </w:r>
-                      <w:proofErr w:type="gramEnd"/>
-                      <w:r>
-                        <w:rPr>
-                          <w:rFonts w:ascii="Cambria" w:hAnsi="Cambria"/>
-                          <w:color w:val="000000"/>
-                          <w:w w:val="115"/>
-                        </w:rPr>
-                        <w:t xml:space="preserve">* </w:t>
-                      </w:r>
-                      <w:proofErr w:type="gramStart"/>
-                      <w:r>
-                        <w:rPr>
-                          <w:rFonts w:ascii="Cambria" w:hAnsi="Cambria"/>
-                          <w:color w:val="000000"/>
-                          <w:w w:val="105"/>
-                        </w:rPr>
-                        <w:t>TO</w:t>
-                      </w:r>
-                      <w:r>
-                        <w:rPr>
-                          <w:rFonts w:ascii="Cambria" w:hAnsi="Cambria"/>
-                          <w:color w:val="000000"/>
-                          <w:spacing w:val="53"/>
-                          <w:w w:val="130"/>
-                        </w:rPr>
-                        <w:t xml:space="preserve"> </w:t>
-                      </w:r>
-                      <w:r>
-                        <w:rPr>
-                          <w:rFonts w:ascii="Cambria" w:hAnsi="Cambria"/>
-                          <w:color w:val="000000"/>
-                          <w:w w:val="130"/>
-                        </w:rPr>
-                        <w:t>’</w:t>
-                      </w:r>
-                      <w:proofErr w:type="gramEnd"/>
-                      <w:r>
-                        <w:rPr>
-                          <w:rFonts w:ascii="Cambria" w:hAnsi="Cambria"/>
-                          <w:color w:val="000000"/>
-                          <w:spacing w:val="-35"/>
-                          <w:w w:val="130"/>
-                        </w:rPr>
-                        <w:t xml:space="preserve"> </w:t>
-                      </w:r>
-                      <w:proofErr w:type="spellStart"/>
-                      <w:r>
-                        <w:rPr>
-                          <w:rFonts w:ascii="Cambria" w:hAnsi="Cambria"/>
-                          <w:color w:val="000000"/>
-                          <w:spacing w:val="19"/>
-                          <w:w w:val="125"/>
-                        </w:rPr>
-                        <w:t>fleetwise_</w:t>
-                      </w:r>
-                      <w:proofErr w:type="gramStart"/>
-                      <w:r>
-                        <w:rPr>
-                          <w:rFonts w:ascii="Cambria" w:hAnsi="Cambria"/>
-                          <w:color w:val="000000"/>
-                          <w:spacing w:val="19"/>
-                          <w:w w:val="125"/>
-                        </w:rPr>
-                        <w:t>user</w:t>
-                      </w:r>
-                      <w:proofErr w:type="spellEnd"/>
-                      <w:r>
-                        <w:rPr>
-                          <w:rFonts w:ascii="Cambria" w:hAnsi="Cambria"/>
-                          <w:color w:val="000000"/>
-                          <w:spacing w:val="-24"/>
-                          <w:w w:val="125"/>
-                        </w:rPr>
-                        <w:t xml:space="preserve"> </w:t>
-                      </w:r>
-                      <w:r>
-                        <w:rPr>
-                          <w:rFonts w:ascii="Cambria" w:hAnsi="Cambria"/>
-                          <w:color w:val="000000"/>
-                          <w:spacing w:val="15"/>
-                          <w:w w:val="130"/>
-                        </w:rPr>
-                        <w:t>’</w:t>
-                      </w:r>
-                      <w:proofErr w:type="gramEnd"/>
-                      <w:r>
-                        <w:rPr>
-                          <w:rFonts w:ascii="Cambria" w:hAnsi="Cambria"/>
-                          <w:color w:val="000000"/>
-                          <w:spacing w:val="15"/>
-                          <w:w w:val="130"/>
-                        </w:rPr>
-                        <w:t>@’</w:t>
-                      </w:r>
-                      <w:r>
-                        <w:rPr>
-                          <w:rFonts w:ascii="Cambria" w:hAnsi="Cambria"/>
-                          <w:color w:val="000000"/>
-                          <w:spacing w:val="-36"/>
-                          <w:w w:val="130"/>
-                        </w:rPr>
-                        <w:t xml:space="preserve"> </w:t>
-                      </w:r>
-                      <w:proofErr w:type="gramStart"/>
-                      <w:r>
-                        <w:rPr>
-                          <w:rFonts w:ascii="Cambria" w:hAnsi="Cambria"/>
-                          <w:color w:val="000000"/>
-                          <w:spacing w:val="17"/>
-                          <w:w w:val="125"/>
-                        </w:rPr>
-                        <w:t>localhost</w:t>
-                      </w:r>
-                      <w:r>
-                        <w:rPr>
-                          <w:rFonts w:ascii="Cambria" w:hAnsi="Cambria"/>
-                          <w:color w:val="000000"/>
-                          <w:spacing w:val="-25"/>
-                          <w:w w:val="125"/>
-                        </w:rPr>
-                        <w:t xml:space="preserve"> </w:t>
-                      </w:r>
-                      <w:r>
-                        <w:rPr>
-                          <w:rFonts w:ascii="Cambria" w:hAnsi="Cambria"/>
-                          <w:color w:val="000000"/>
-                          <w:spacing w:val="9"/>
-                          <w:w w:val="130"/>
-                        </w:rPr>
-                        <w:t>’</w:t>
-                      </w:r>
-                      <w:proofErr w:type="gramEnd"/>
-                      <w:r>
-                        <w:rPr>
-                          <w:rFonts w:ascii="Cambria" w:hAnsi="Cambria"/>
-                          <w:color w:val="000000"/>
-                          <w:spacing w:val="9"/>
-                          <w:w w:val="130"/>
-                        </w:rPr>
-                        <w:t>;</w:t>
+                        <w:t>';</w:t>
                       </w:r>
                     </w:p>
                     <w:p>
@@ -18056,55 +17128,6 @@
                         <w:rPr>
                           <w:rFonts w:ascii="Cambria"/>
                           <w:color w:val="000000"/>
-                          <w:spacing w:val="14"/>
-                        </w:rPr>
-                        <w:t>FLUSH</w:t>
-                      </w:r>
-                      <w:r>
-                        <w:rPr>
-                          <w:rFonts w:ascii="Cambria"/>
-                          <w:color w:val="000000"/>
-                          <w:spacing w:val="80"/>
-                        </w:rPr>
-                        <w:t xml:space="preserve"> </w:t>
-                      </w:r>
-                      <w:proofErr w:type="gramStart"/>
-                      <w:r>
-                        <w:rPr>
-                          <w:rFonts w:ascii="Cambria"/>
-                          <w:color w:val="000000"/>
-                          <w:spacing w:val="18"/>
-                        </w:rPr>
-                        <w:t>PRIVILEGES</w:t>
-                      </w:r>
-                      <w:r>
-                        <w:rPr>
-                          <w:rFonts w:ascii="Cambria"/>
-                          <w:color w:val="000000"/>
-                          <w:spacing w:val="-17"/>
-                        </w:rPr>
-                        <w:t xml:space="preserve"> </w:t>
-                      </w:r>
-                      <w:r>
-                        <w:rPr>
-                          <w:rFonts w:ascii="Cambria"/>
-                          <w:color w:val="000000"/>
-                        </w:rPr>
-                        <w:t>;</w:t>
-                      </w:r>
-                      <w:proofErr w:type="gramEnd"/>
-                      <w:r>
-                        <w:rPr>
-                          <w:rFonts w:ascii="Cambria"/>
-                          <w:color w:val="000000"/>
-                        </w:rPr>
-                        <w:t xml:space="preserve"> </w:t>
-                      </w:r>
-                      <w:proofErr w:type="gramStart"/>
-                      <w:r>
-                        <w:rPr>
-                          <w:rFonts w:ascii="Cambria"/>
-                          <w:color w:val="000000"/>
                           <w:spacing w:val="13"/>
                           <w:w w:val="110"/>
                         </w:rPr>
@@ -18114,20 +17137,10 @@
                         <w:rPr>
                           <w:rFonts w:ascii="Cambria"/>
                           <w:color w:val="000000"/>
-                          <w:spacing w:val="-24"/>
-                          <w:w w:val="110"/>
-                        </w:rPr>
-                        <w:t xml:space="preserve"> </w:t>
-                      </w:r>
-                      <w:r>
-                        <w:rPr>
-                          <w:rFonts w:ascii="Cambria"/>
-                          <w:color w:val="000000"/>
                           <w:w w:val="170"/>
                         </w:rPr>
                         <w:t>;</w:t>
                       </w:r>
-                      <w:proofErr w:type="gramEnd"/>
                     </w:p>
                   </w:txbxContent>
                 </v:textbox>
@@ -28729,7 +27742,6 @@
                                 <w:color w:val="000000"/>
                               </w:rPr>
                             </w:pPr>
-                            <w:proofErr w:type="gramStart"/>
                             <w:r>
                               <w:rPr>
                                 <w:rFonts w:ascii="Cambria"/>
@@ -28746,7 +27758,7 @@
                                 <w:spacing w:val="29"/>
                                 <w:w w:val="110"/>
                               </w:rPr>
-                              <w:t xml:space="preserve">  </w:t>
+                              <w:t xml:space="preserve"> </w:t>
                             </w:r>
                             <w:r>
                               <w:rPr>
@@ -28757,34 +27769,14 @@
                               </w:rPr>
                               <w:t>run</w:t>
                             </w:r>
-                            <w:proofErr w:type="gramEnd"/>
-                            <w:r>
-                              <w:rPr>
-                                <w:rFonts w:ascii="Cambria"/>
-                                <w:color w:val="000000"/>
-                                <w:spacing w:val="-23"/>
+                            <w:r>
+                              <w:rPr>
+                                <w:rFonts w:ascii="Cambria"/>
+                                <w:color w:val="000000"/>
                                 <w:w w:val="110"/>
                               </w:rPr>
-                              <w:t xml:space="preserve"> </w:t>
-                            </w:r>
-                            <w:r>
-                              <w:rPr>
-                                <w:rFonts w:ascii="Cambria"/>
-                                <w:color w:val="000000"/>
-                                <w:w w:val="110"/>
-                              </w:rPr>
                               <w:t>.</w:t>
                             </w:r>
-                            <w:r>
-                              <w:rPr>
-                                <w:rFonts w:ascii="Cambria"/>
-                                <w:color w:val="000000"/>
-                                <w:spacing w:val="-27"/>
-                                <w:w w:val="110"/>
-                              </w:rPr>
-                              <w:t xml:space="preserve"> </w:t>
-                            </w:r>
-                            <w:proofErr w:type="spellStart"/>
                             <w:r>
                               <w:rPr>
                                 <w:rFonts w:ascii="Cambria"/>
@@ -28794,7 +27786,6 @@
                               </w:rPr>
                               <w:t>py</w:t>
                             </w:r>
-                            <w:proofErr w:type="spellEnd"/>
                           </w:p>
                           <w:p>
                             <w:pPr>
@@ -28952,7 +27943,6 @@
                           <w:color w:val="000000"/>
                         </w:rPr>
                       </w:pPr>
-                      <w:proofErr w:type="gramStart"/>
                       <w:r>
                         <w:rPr>
                           <w:rFonts w:ascii="Cambria"/>
@@ -28969,7 +27959,7 @@
                           <w:spacing w:val="29"/>
                           <w:w w:val="110"/>
                         </w:rPr>
-                        <w:t xml:space="preserve">  </w:t>
+                        <w:t xml:space="preserve"> </w:t>
                       </w:r>
                       <w:r>
                         <w:rPr>
@@ -28980,34 +27970,14 @@
                         </w:rPr>
                         <w:t>run</w:t>
                       </w:r>
-                      <w:proofErr w:type="gramEnd"/>
-                      <w:r>
-                        <w:rPr>
-                          <w:rFonts w:ascii="Cambria"/>
-                          <w:color w:val="000000"/>
-                          <w:spacing w:val="-23"/>
+                      <w:r>
+                        <w:rPr>
+                          <w:rFonts w:ascii="Cambria"/>
+                          <w:color w:val="000000"/>
                           <w:w w:val="110"/>
                         </w:rPr>
-                        <w:t xml:space="preserve"> </w:t>
-                      </w:r>
-                      <w:r>
-                        <w:rPr>
-                          <w:rFonts w:ascii="Cambria"/>
-                          <w:color w:val="000000"/>
-                          <w:w w:val="110"/>
-                        </w:rPr>
                         <w:t>.</w:t>
                       </w:r>
-                      <w:r>
-                        <w:rPr>
-                          <w:rFonts w:ascii="Cambria"/>
-                          <w:color w:val="000000"/>
-                          <w:spacing w:val="-27"/>
-                          <w:w w:val="110"/>
-                        </w:rPr>
-                        <w:t xml:space="preserve"> </w:t>
-                      </w:r>
-                      <w:proofErr w:type="spellStart"/>
                       <w:r>
                         <w:rPr>
                           <w:rFonts w:ascii="Cambria"/>
@@ -29017,7 +27987,6 @@
                         </w:rPr>
                         <w:t>py</w:t>
                       </w:r>
-                      <w:proofErr w:type="spellEnd"/>
                     </w:p>
                     <w:p>
                       <w:pPr>
@@ -37139,7 +36108,7 @@
         </mc:Choice>
         <mc:Fallback>
           <w:pict>
-            <v:shape w14:anchorId="7C8F65E5" id="Graphic 1" o:spid="_x0000_s1026" style="position:absolute;margin-left:1in;margin-top:49.8pt;width:451.3pt;height:.1pt;z-index:-16105472;visibility:visible;mso-wrap-style:square;mso-wrap-distance-left:0;mso-wrap-distance-top:0;mso-wrap-distance-right:0;mso-wrap-distance-bottom:0;mso-position-horizontal:absolute;mso-position-horizontal-relative:page;mso-position-vertical:absolute;mso-position-vertical-relative:page;v-text-anchor:top" coordsize="5731510,1270" o:gfxdata="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" path="m,l5731205,e" filled="f" strokeweight=".14039mm">
+            <v:shape w14:anchorId="2C9F4B07" id="Graphic 1" o:spid="_x0000_s1026" style="position:absolute;margin-left:1in;margin-top:49.8pt;width:451.3pt;height:.1pt;z-index:-16105472;visibility:visible;mso-wrap-style:square;mso-wrap-distance-left:0;mso-wrap-distance-top:0;mso-wrap-distance-right:0;mso-wrap-distance-bottom:0;mso-position-horizontal:absolute;mso-position-horizontal-relative:page;mso-position-vertical:absolute;mso-position-vertical-relative:page;v-text-anchor:top" coordsize="5731510,1270" o:gfxdata="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" path="m,l5731205,e" filled="f" strokeweight=".14039mm">
               <v:path arrowok="t"/>
               <w10:wrap anchorx="page" anchory="page"/>
             </v:shape>
@@ -37671,7 +36640,6 @@
       <w:lvlJc w:val="left"/>
       <w:pPr>
         <w:ind w:left="374" w:hanging="352"/>
-        <w:jc w:val="left"/>
       </w:pPr>
       <w:rPr>
         <w:rFonts w:ascii="Georgia" w:eastAsia="Georgia" w:hAnsi="Georgia" w:cs="Georgia" w:hint="default"/>
@@ -37693,7 +36661,6 @@
       <w:lvlJc w:val="left"/>
       <w:pPr>
         <w:ind w:left="912" w:hanging="539"/>
-        <w:jc w:val="left"/>
       </w:pPr>
       <w:rPr>
         <w:rFonts w:ascii="Times New Roman" w:eastAsia="Times New Roman" w:hAnsi="Times New Roman" w:cs="Times New Roman" w:hint="default"/>
@@ -37925,7 +36892,6 @@
       <w:lvlJc w:val="left"/>
       <w:pPr>
         <w:ind w:left="604" w:hanging="582"/>
-        <w:jc w:val="left"/>
       </w:pPr>
       <w:rPr>
         <w:rFonts w:ascii="Georgia" w:eastAsia="Georgia" w:hAnsi="Georgia" w:cs="Georgia" w:hint="default"/>
@@ -37947,7 +36913,6 @@
       <w:lvlJc w:val="left"/>
       <w:pPr>
         <w:ind w:left="758" w:hanging="736"/>
-        <w:jc w:val="left"/>
       </w:pPr>
       <w:rPr>
         <w:rFonts w:ascii="Georgia" w:eastAsia="Georgia" w:hAnsi="Georgia" w:cs="Georgia" w:hint="default"/>
@@ -38308,7 +37273,6 @@
       <w:lvlJc w:val="left"/>
       <w:pPr>
         <w:ind w:left="608" w:hanging="300"/>
-        <w:jc w:val="left"/>
       </w:pPr>
       <w:rPr>
         <w:rFonts w:ascii="Times New Roman" w:eastAsia="Times New Roman" w:hAnsi="Times New Roman" w:cs="Times New Roman" w:hint="default"/>
@@ -38913,7 +37877,6 @@
   <w:style w:type="character" w:default="1" w:styleId="DefaultParagraphFont">
     <w:name w:val="Default Paragraph Font"/>
     <w:uiPriority w:val="1"/>
-    <w:semiHidden/>
     <w:unhideWhenUsed/>
   </w:style>
   <w:style w:type="table" w:default="1" w:styleId="TableNormal">

</xml_diff>